<commit_message>
feat(saff-study): publish specification and test suite v2.1
</commit_message>
<xml_diff>
--- a/output/docx/LoginServidorAdministrador.docx
+++ b/output/docx/LoginServidorAdministrador.docx
@@ -788,164 +788,6 @@
         <w:br/>
       </w:r>
     </w:p>
-    <w:p>
-      <w:pPr>
-        <w:spacing w:before="180" w:after="60"/>
-      </w:pPr>
-      <w:r>
-        <w:rPr>
-          <w:b w:val="on"/>
-          <w:sz w:val="24"/>
-          <w:color w:val="2B6CB0"/>
-        </w:rPr>
-        <w:t>[TC5] Exception Flow 3: Usuario inativo por 30 minutos</w:t>
-      </w:r>
-    </w:p>
-    <w:p>
-      <w:pPr>
-        <w:spacing w:after="40"/>
-      </w:pPr>
-      <w:r>
-        <w:rPr>
-          <w:b w:val="on"/>
-          <w:sz w:val="20"/>
-        </w:rPr>
-        <w:t xml:space="preserve">Preconditions: </w:t>
-      </w:r>
-      <w:r>
-        <w:rPr>
-          <w:sz w:val="20"/>
-        </w:rPr>
-        <w:t>Deve existir um usuário cadastrado com perfil administrador</w:t>
-      </w:r>
-    </w:p>
-    <w:p>
-      <w:pPr>
-        <w:spacing w:after="40"/>
-      </w:pPr>
-      <w:r>
-        <w:rPr>
-          <w:b w:val="on"/>
-          <w:sz w:val="20"/>
-        </w:rPr>
-        <w:t xml:space="preserve">Postconditions: </w:t>
-      </w:r>
-      <w:r>
-        <w:rPr>
-          <w:sz w:val="20"/>
-        </w:rPr>
-        <w:t>Flow interrupted due to exception / error</w:t>
-      </w:r>
-    </w:p>
-    <w:tbl>
-      <w:tblPr>
-        <w:tblW w:w="5000" w:type="pct"/>
-        <w:tblBorders>
-          <w:top w:val="single"/>
-          <w:left w:val="single"/>
-          <w:bottom w:val="single"/>
-          <w:right w:val="single"/>
-          <w:insideH w:val="single"/>
-          <w:insideV w:val="single"/>
-        </w:tblBorders>
-      </w:tblPr>
-      <w:tr>
-        <w:tc>
-          <w:tcPr>
-            <w:tcW w:w="1200" w:type="dxa"/>
-            <w:shd w:color="auto" w:val="clear" w:fill="2B6CB0"/>
-          </w:tcPr>
-          <w:p>
-            <w:pPr>
-              <w:jc w:val="left"/>
-            </w:pPr>
-            <w:r>
-              <w:rPr>
-                <w:b w:val="on"/>
-                <w:sz w:val="20"/>
-                <w:color w:val="FFFFFF"/>
-              </w:rPr>
-              <w:t>Step #</w:t>
-            </w:r>
-          </w:p>
-        </w:tc>
-        <w:tc>
-          <w:tcPr>
-            <w:tcW w:w="4500" w:type="dxa"/>
-            <w:shd w:color="auto" w:val="clear" w:fill="2B6CB0"/>
-          </w:tcPr>
-          <w:p>
-            <w:pPr>
-              <w:jc w:val="left"/>
-            </w:pPr>
-            <w:r>
-              <w:rPr>
-                <w:b w:val="on"/>
-                <w:sz w:val="20"/>
-                <w:color w:val="FFFFFF"/>
-              </w:rPr>
-              <w:t>Actor Action</w:t>
-            </w:r>
-          </w:p>
-        </w:tc>
-        <w:tc>
-          <w:tcPr>
-            <w:tcW w:w="4500" w:type="dxa"/>
-            <w:shd w:color="auto" w:val="clear" w:fill="2B6CB0"/>
-          </w:tcPr>
-          <w:p>
-            <w:pPr>
-              <w:jc w:val="left"/>
-            </w:pPr>
-            <w:r>
-              <w:rPr>
-                <w:b w:val="on"/>
-                <w:sz w:val="20"/>
-                <w:color w:val="FFFFFF"/>
-              </w:rPr>
-              <w:t>Expected Result (System)</w:t>
-            </w:r>
-          </w:p>
-        </w:tc>
-      </w:tr>
-      <w:tr>
-        <w:tc>
-          <w:p>
-            <w:r>
-              <w:rPr>
-                <w:sz w:val="18"/>
-              </w:rPr>
-              <w:t>1</w:t>
-            </w:r>
-          </w:p>
-        </w:tc>
-        <w:tc>
-          <w:p>
-            <w:r>
-              <w:rPr>
-                <w:sz w:val="18"/>
-              </w:rPr>
-              <w:t>system: SYSTEM: finaliza sessao do usuario e retorna a pagina de login</w:t>
-            </w:r>
-          </w:p>
-        </w:tc>
-        <w:tc>
-          <w:p>
-            <w:r>
-              <w:rPr>
-                <w:sz w:val="18"/>
-              </w:rPr>
-              <w:t>finaliza sessao do usuario e retorna a pagina de login</w:t>
-            </w:r>
-          </w:p>
-        </w:tc>
-      </w:tr>
-    </w:tbl>
-    <w:p>
-      <w:r>
-        <w:br/>
-      </w:r>
-    </w:p>
   </w:body>
 </w:document>
 </file>
</xml_diff>